<commit_message>
Updated the paper with ICETSE requirement
</commit_message>
<xml_diff>
--- a/Documentation/Survey Paper/Survey-paper1.docx
+++ b/Documentation/Survey Paper/Survey-paper1.docx
@@ -316,14 +316,23 @@
           <w:iCs/>
           <w:lang w:val="en-IN"/>
         </w:rPr>
-        <w:t>¹revanthkumarts123@gmail.com, ²sankethcoding@gmail.com,</w:t>
-      </w:r>
+        <w:t>¹revanthkumarts123@gmail.com, ²</w:t>
+      </w:r>
+      <w:proofErr w:type="gramStart"/>
       <w:r>
         <w:rPr>
           <w:iCs/>
+          <w:lang w:val="en-IN"/>
+        </w:rPr>
+        <w:t>sankethcoding@gmail.com,</w:t>
+      </w:r>
+      <w:r>
+        <w:rPr>
+          <w:iCs/>
         </w:rPr>
         <w:t>³</w:t>
       </w:r>
+      <w:proofErr w:type="gramEnd"/>
       <w:r>
         <w:rPr>
           <w:iCs/>
@@ -418,7 +427,9 @@
     <w:p>
       <w:pPr>
         <w:pStyle w:val="Abstract"/>
-        <w:ind w:firstLine="0pt"/>
+        <w:rPr>
+          <w:lang w:val="en-IN"/>
+        </w:rPr>
       </w:pPr>
       <w:r>
         <w:rPr>
@@ -463,7 +474,38 @@
         <w:t xml:space="preserve"> </w:t>
       </w:r>
       <w:r>
-        <w:t>DevOps fixed one problem. Development and operations had always worked in separate lanes, and that separation slowed everything down. Bringing them together shortened release cycles considerably. Security never got the same treatment. It stayed at the back — handled close to the deadline, after the decisions that actually determined the shape of the product had long been finalised. That worked, after a fashion, when releases were infrequent. It stopped working when applications became permanent internet targets and a single breach carried real consequences</w:t>
+        <w:rPr>
+          <w:lang w:val="en-IN"/>
+        </w:rPr>
+        <w:t xml:space="preserve">DevOps helped to advance software delivery using a blend of development and operation practices, to provide faster and more dependable releases. Security was still usually perceived as an </w:t>
+      </w:r>
+      <w:proofErr w:type="spellStart"/>
+      <w:r>
+        <w:rPr>
+          <w:lang w:val="en-IN"/>
+        </w:rPr>
+        <w:t>after thought</w:t>
+      </w:r>
+      <w:proofErr w:type="spellEnd"/>
+      <w:r>
+        <w:rPr>
+          <w:lang w:val="en-IN"/>
+        </w:rPr>
+        <w:t xml:space="preserve"> towards the end of software development, therefore problems with security are only uncovered toward the end. </w:t>
+      </w:r>
+      <w:proofErr w:type="spellStart"/>
+      <w:r>
+        <w:rPr>
+          <w:lang w:val="en-IN"/>
+        </w:rPr>
+        <w:t>DevSecOps</w:t>
+      </w:r>
+      <w:proofErr w:type="spellEnd"/>
+      <w:r>
+        <w:rPr>
+          <w:lang w:val="en-IN"/>
+        </w:rPr>
+        <w:t xml:space="preserve"> tries to improve on this by embedding security within the different steps of the CI/CD pipeline</w:t>
       </w:r>
       <w:r>
         <w:t>.</w:t>
@@ -472,9 +514,57 @@
     <w:p>
       <w:pPr>
         <w:pStyle w:val="Abstract"/>
-      </w:pPr>
-      <w:r>
-        <w:t>DevSecOps came from that pressure. Its core position is blunt: by the time code is deployed, security feedback cannot change it</w:t>
+        <w:rPr>
+          <w:lang w:val="en-IN"/>
+        </w:rPr>
+      </w:pPr>
+      <w:r>
+        <w:rPr>
+          <w:lang w:val="en-IN"/>
+        </w:rPr>
+        <w:t xml:space="preserve">This paper presents a secured </w:t>
+      </w:r>
+      <w:proofErr w:type="spellStart"/>
+      <w:r>
+        <w:rPr>
+          <w:lang w:val="en-IN"/>
+        </w:rPr>
+        <w:t>DevSecOps</w:t>
+      </w:r>
+      <w:proofErr w:type="spellEnd"/>
+      <w:r>
+        <w:rPr>
+          <w:lang w:val="en-IN"/>
+        </w:rPr>
+        <w:t xml:space="preserve"> pipeline using Git &amp; Jenkins for CI, SonarQube for Static Code Analysis, </w:t>
+      </w:r>
+      <w:proofErr w:type="spellStart"/>
+      <w:r>
+        <w:rPr>
+          <w:lang w:val="en-IN"/>
+        </w:rPr>
+        <w:t>Trivy</w:t>
+      </w:r>
+      <w:proofErr w:type="spellEnd"/>
+      <w:r>
+        <w:rPr>
+          <w:lang w:val="en-IN"/>
+        </w:rPr>
+        <w:t xml:space="preserve"> for Container Security Scanning, OWASP ZAP for Dynamic Application Security Testing, Docker &amp; Kubernetes for containerized deployment and Prometheus &amp; Grafana for monitoring. The presented pipeline automates security verification right from the source code level to the runtime, which detects security vulnerabilities in prior to production deployment while ensuring Continuous Delivery of software.</w:t>
+      </w:r>
+    </w:p>
+    <w:p>
+      <w:pPr>
+        <w:pStyle w:val="Abstract"/>
+        <w:rPr>
+          <w:lang w:val="en-IN"/>
+        </w:rPr>
+      </w:pPr>
+      <w:r>
+        <w:rPr>
+          <w:lang w:val="en-IN"/>
+        </w:rPr>
+        <w:t>As shown in the demonstration, by embedding checks at different stages of the CI/CD pipeline: an organization can get enhanced application visibility by identifying vulnerable code early, reduce security testing load, deploy more reliably, and gain visibility into application health with automated monitoring. The framework offers a pragmatic method for developing efficient and secured software delivery</w:t>
       </w:r>
       <w:r>
         <w:t>.</w:t>
@@ -483,83 +573,64 @@
     <w:p>
       <w:pPr>
         <w:pStyle w:val="Abstract"/>
-      </w:pPr>
-      <w:r>
-        <w:t>Putting that into practice exposes a different set of problems. Pipelines built purely around delivery do not naturally accommodate security tooling. Developers focused on shipping features are not trained to read scanner output — and a scanner that flags fifty issues without any priority ordering teaches developers to ignore it. The signal drowns</w:t>
-      </w:r>
-      <w:r>
+        <w:rPr>
+          <w:rFonts w:eastAsia="Times New Roman"/>
+          <w:lang w:val="en-IN" w:eastAsia="en-IN"/>
+        </w:rPr>
+      </w:pPr>
+      <w:r>
+        <w:rPr>
+          <w:rFonts w:eastAsia="Times New Roman"/>
+          <w:lang w:val="en-IN" w:eastAsia="en-IN"/>
+        </w:rPr>
+        <w:t>Keywords</w:t>
+      </w:r>
+      <w:r>
+        <w:rPr>
+          <w:rFonts w:eastAsia="Times New Roman"/>
+          <w:lang w:val="en-IN" w:eastAsia="en-IN"/>
+        </w:rPr>
+        <w:t xml:space="preserve"> </w:t>
+      </w:r>
+      <w:r>
+        <w:rPr>
+          <w:rFonts w:eastAsia="Times New Roman"/>
+          <w:lang w:val="en-IN" w:eastAsia="en-IN"/>
+        </w:rPr>
+        <w:t xml:space="preserve">— </w:t>
+      </w:r>
+      <w:proofErr w:type="spellStart"/>
+      <w:r>
+        <w:rPr>
+          <w:rFonts w:eastAsia="Times New Roman"/>
+          <w:lang w:val="en-IN" w:eastAsia="en-IN"/>
+        </w:rPr>
+        <w:t>DevSecOps</w:t>
+      </w:r>
+      <w:proofErr w:type="spellEnd"/>
+      <w:r>
+        <w:rPr>
+          <w:rFonts w:eastAsia="Times New Roman"/>
+          <w:lang w:val="en-IN" w:eastAsia="en-IN"/>
+        </w:rPr>
+        <w:t xml:space="preserve">, CI/CD Pipeline, Static Application Security Testing (SAST), Dynamic Application Security Testing (DAST), Container Security, Continuous </w:t>
+      </w:r>
+      <w:proofErr w:type="gramStart"/>
+      <w:r>
+        <w:rPr>
+          <w:rFonts w:eastAsia="Times New Roman"/>
+          <w:lang w:val="en-IN" w:eastAsia="en-IN"/>
+        </w:rPr>
+        <w:t>Monitoring.</w:t>
+      </w:r>
+      <w:r>
+        <w:rPr>
+          <w:rFonts w:eastAsia="Times New Roman"/>
+          <w:lang w:eastAsia="en-IN"/>
+        </w:rPr>
         <w:t>.</w:t>
       </w:r>
-    </w:p>
-    <w:p>
-      <w:pPr>
-        <w:pStyle w:val="Abstract"/>
-        <w:rPr>
-          <w:lang w:val="en-IN"/>
-        </w:rPr>
-      </w:pPr>
-      <w:r>
-        <w:t>This paper looks at a pipeline where security runs continuously rather than waiting at the door. Git and Jenkins manage the code and the delivery process. SonarQube examines the code itself before anything executes. OWASP ZAP tests how the application actually behaves once it does</w:t>
-      </w:r>
-      <w:r>
-        <w:t>.</w:t>
-      </w:r>
-      <w:r>
-        <w:t xml:space="preserve"> </w:t>
-      </w:r>
-      <w:r>
-        <w:t>Trivy inspects container images. Docker and Kubernetes handle deployment, while Prometheus and Grafana keep runtime behavior visible throughout</w:t>
-      </w:r>
-      <w:r>
-        <w:rPr>
-          <w:lang w:val="en-IN"/>
-        </w:rPr>
-        <w:t>.</w:t>
-      </w:r>
-    </w:p>
-    <w:p>
-      <w:pPr>
-        <w:pStyle w:val="Abstract"/>
-        <w:rPr>
-          <w:rFonts w:eastAsia="Times New Roman"/>
-          <w:lang w:val="en-IN" w:eastAsia="en-IN"/>
-        </w:rPr>
-      </w:pPr>
-      <w:r>
-        <w:rPr>
-          <w:rFonts w:eastAsia="Times New Roman"/>
-          <w:lang w:val="en-IN" w:eastAsia="en-IN"/>
-        </w:rPr>
-        <w:t>Keywords</w:t>
-      </w:r>
-      <w:r>
-        <w:rPr>
-          <w:rFonts w:eastAsia="Times New Roman"/>
-          <w:lang w:val="en-IN" w:eastAsia="en-IN"/>
-        </w:rPr>
-        <w:t xml:space="preserve"> </w:t>
-      </w:r>
-      <w:r>
-        <w:rPr>
-          <w:rFonts w:eastAsia="Times New Roman"/>
-          <w:lang w:val="en-IN" w:eastAsia="en-IN"/>
-        </w:rPr>
-        <w:t xml:space="preserve">— </w:t>
-      </w:r>
-      <w:r>
-        <w:rPr>
-          <w:rFonts w:eastAsia="Times New Roman"/>
-          <w:lang w:eastAsia="en-IN"/>
-        </w:rPr>
-        <w:t>DevSecOps, CI/CD pipeline security, vulnerability scanning, container security, automated security testing, runtime monitoring</w:t>
-      </w:r>
-      <w:r>
-        <w:rPr>
-          <w:rFonts w:eastAsia="Times New Roman"/>
-          <w:lang w:eastAsia="en-IN"/>
-        </w:rPr>
-        <w:t>.</w:t>
-      </w:r>
+      <w:proofErr w:type="gramEnd"/>
     </w:p>
     <w:p>
       <w:pPr>
@@ -628,109 +699,187 @@
         <w:rPr>
           <w:lang w:val="en-US"/>
         </w:rPr>
-        <w:t xml:space="preserve">Containers arrived around the same period and were dealing with a different but equally familiar frustration. The scenario most developers have lived through at least once — code that runs cleanly on a local machine and then breaks the </w:t>
-      </w:r>
-      <w:r>
+        <w:t xml:space="preserve">Containers arrived around the same period and were dealing with a different but equally familiar frustration. The scenario most developers have lived through at least once — code that runs cleanly on a local machine and then breaks the moment it lands somewhere else — was exactly what containers were built to address. </w:t>
+      </w:r>
+      <w:r>
+        <w:rPr>
+          <w:lang w:val="en-IN"/>
+        </w:rPr>
+        <w:t>The environment follows the application. This eliminates any disparity that previously led to constant surprises just before go-live</w:t>
+      </w:r>
+      <w:r>
+        <w:rPr>
+          <w:lang w:val="en-IN"/>
+        </w:rPr>
+        <w:t>.</w:t>
+      </w:r>
+    </w:p>
+    <w:p>
+      <w:pPr>
+        <w:pStyle w:val="BodyText"/>
         <w:rPr>
           <w:lang w:val="en-US"/>
         </w:rPr>
-        <w:t xml:space="preserve">moment it lands somewhere else — was exactly what containers were built to address. </w:t>
-      </w:r>
-      <w:r>
+      </w:pPr>
+      <w:r>
+        <w:rPr>
+          <w:lang w:val="en-US"/>
+        </w:rPr>
+        <w:t xml:space="preserve">As such systems became more prevalent, however, vulnerabilities in their architecture started appearing. </w:t>
+      </w:r>
+      <w:r>
+        <w:rPr>
+          <w:lang w:val="en-US"/>
+        </w:rPr>
+        <w:t xml:space="preserve">Before </w:t>
+      </w:r>
+      <w:proofErr w:type="spellStart"/>
+      <w:r>
+        <w:rPr>
+          <w:lang w:val="en-US"/>
+        </w:rPr>
+        <w:t>DevSecOps</w:t>
+      </w:r>
+      <w:proofErr w:type="spellEnd"/>
+      <w:r>
+        <w:rPr>
+          <w:lang w:val="en-US"/>
+        </w:rPr>
+        <w:t xml:space="preserve"> existed, the security tests were being performed during the last stages of software development just before it was being released. This was a bad way of working; </w:t>
+      </w:r>
+      <w:proofErr w:type="gramStart"/>
+      <w:r>
+        <w:rPr>
+          <w:lang w:val="en-US"/>
+        </w:rPr>
+        <w:t>however</w:t>
+      </w:r>
+      <w:proofErr w:type="gramEnd"/>
+      <w:r>
+        <w:rPr>
+          <w:lang w:val="en-US"/>
+        </w:rPr>
+        <w:t xml:space="preserve"> it was acceptable at the time because there were only a handful of new releases a couple of times per month. However, as the rate of releases into production was being pushed to one or several times per day, or per hour, it was no longer acceptable to be performed tests between the new releases and the new release. This generated serious problems; if a bug is discovered weeks after the development has been undertaken then it can be very complex to find a suitable fix, and also the fix could also have consequences to both business and technical decisions that would have been made at the beginning of the development. </w:t>
+      </w:r>
+      <w:proofErr w:type="spellStart"/>
+      <w:r>
+        <w:rPr>
+          <w:lang w:val="en-US"/>
+        </w:rPr>
+        <w:t>DevSecOps</w:t>
+      </w:r>
+      <w:proofErr w:type="spellEnd"/>
+      <w:r>
+        <w:rPr>
+          <w:lang w:val="en-US"/>
+        </w:rPr>
+        <w:t xml:space="preserve"> was born because software developers and IT professional were facing many of these problems; its basic underlying rule is that there cannot be security added to something that did not </w:t>
+      </w:r>
+      <w:proofErr w:type="gramStart"/>
+      <w:r>
+        <w:rPr>
+          <w:lang w:val="en-US"/>
+        </w:rPr>
+        <w:t>had</w:t>
+      </w:r>
+      <w:proofErr w:type="gramEnd"/>
+      <w:r>
+        <w:rPr>
+          <w:lang w:val="en-US"/>
+        </w:rPr>
+        <w:t xml:space="preserve"> it from the very first day</w:t>
+      </w:r>
+      <w:r>
+        <w:rPr>
+          <w:lang w:val="en-US"/>
+        </w:rPr>
+        <w:t>.</w:t>
+      </w:r>
+    </w:p>
+    <w:p>
+      <w:pPr>
+        <w:pStyle w:val="BodyText"/>
         <w:rPr>
           <w:lang w:val="en-IN"/>
         </w:rPr>
-        <w:t>The environment follows the application. This eliminates any disparity that previously led to constant surprises just before go-live</w:t>
-      </w:r>
-      <w:r>
+      </w:pPr>
+      <w:r>
+        <w:rPr>
+          <w:lang w:val="en-US"/>
+        </w:rPr>
+        <w:t>For many companies, the challenge was not about convincing them to use a security solution, but to integrate a security solution into their already live production systems. Implementing a change to a live production system will always be risky and most engineering teams were already over-burdened and couldn't justify spending extra time finding a security solution. It was a problem with tooling as well; the point of a scanner is to provide a list of vulnerabilities, but a scanner can easily be misunderstood, or simply overlooked if the person viewing it doesn't truly understand what the results mean</w:t>
+      </w:r>
+      <w:r>
+        <w:rPr>
+          <w:lang w:val="en-US"/>
+        </w:rPr>
+        <w:t>.</w:t>
+      </w:r>
+    </w:p>
+    <w:p>
+      <w:pPr>
+        <w:pStyle w:val="BodyText"/>
         <w:rPr>
           <w:lang w:val="en-IN"/>
         </w:rPr>
+      </w:pPr>
+      <w:r>
+        <w:rPr>
+          <w:lang w:val="en-IN"/>
+        </w:rPr>
+        <w:t>Fig</w:t>
+      </w:r>
+      <w:r>
+        <w:rPr>
+          <w:lang w:val="en-IN"/>
+        </w:rPr>
         <w:t>.</w:t>
       </w:r>
-    </w:p>
-    <w:p>
-      <w:pPr>
-        <w:pStyle w:val="BodyText"/>
-        <w:rPr>
-          <w:lang w:val="en-US"/>
-        </w:rPr>
-      </w:pPr>
-      <w:r>
-        <w:rPr>
-          <w:lang w:val="en-US"/>
-        </w:rPr>
-        <w:t xml:space="preserve">As such systems became more prevalent, however, vulnerabilities in their architecture started appearing. </w:t>
-      </w:r>
-      <w:r>
-        <w:rPr>
-          <w:lang w:val="en-US"/>
-        </w:rPr>
-        <w:t>Before DevSecOps existed, the security tests were being performed during the last stages of software development just before it was being released. This was a bad way of working; however it was acceptable at the time because there were only a handful of new releases a couple of times per month. However, as the rate of releases into production was being pushed to one or several times per day, or per hour, it was no longer acceptable to be performed tests between the new releases and the new release. This generated serious problems; if a bug is discovered weeks after the development has been undertaken then it can be very complex to find a suitable fix, and also the fix could also have consequences to both business and technical decisions that would have been made at the beginning of the development. DevSecOps was born because software developers and IT professional were facing many of these problems; its basic underlying rule is that there cannot be security added to something that did not had it from the very first day</w:t>
-      </w:r>
-      <w:r>
-        <w:rPr>
-          <w:lang w:val="en-US"/>
-        </w:rPr>
-        <w:t>.</w:t>
-      </w:r>
-    </w:p>
-    <w:p>
-      <w:pPr>
-        <w:pStyle w:val="BodyText"/>
+      <w:r>
         <w:rPr>
           <w:lang w:val="en-IN"/>
         </w:rPr>
-      </w:pPr>
-      <w:r>
-        <w:rPr>
-          <w:lang w:val="en-US"/>
-        </w:rPr>
-        <w:t>For many companies, the challenge was not about convincing them to use a security solution, but to integrate a security solution into their already live production systems. Implementing a change to a live production system will always be risky and most engineering teams were already over-burdened and couldn't justify spending extra time finding a security solution. It was a problem with tooling as well; the point of a scanner is to provide a list of vulnerabilities, but a scanner can easily be misunderstood, or simply overlooked if the person viewing it doesn't truly understand what the results mean</w:t>
-      </w:r>
-      <w:r>
-        <w:rPr>
-          <w:lang w:val="en-US"/>
-        </w:rPr>
-        <w:t>.</w:t>
-      </w:r>
-    </w:p>
-    <w:p>
-      <w:pPr>
-        <w:pStyle w:val="BodyText"/>
+        <w:t xml:space="preserve"> 1 illustrates the relationship between the three key components of </w:t>
+      </w:r>
+      <w:proofErr w:type="spellStart"/>
+      <w:r>
         <w:rPr>
           <w:lang w:val="en-IN"/>
         </w:rPr>
-      </w:pPr>
+        <w:t>DevSecOps</w:t>
+      </w:r>
+      <w:proofErr w:type="spellEnd"/>
       <w:r>
         <w:rPr>
           <w:lang w:val="en-IN"/>
         </w:rPr>
-        <w:t>Fig</w:t>
+        <w:t xml:space="preserve">. The development component entails code creation, system integration, and release management. On the other hand, operations involve the technical component of the system and ensure its availability, reliability, and scalability. Lastly, security encompasses scanning, identification, and controls. As illustrated by the figure </w:t>
       </w:r>
       <w:r>
         <w:rPr>
           <w:lang w:val="en-IN"/>
         </w:rPr>
-        <w:t>.</w:t>
+        <w:t>below</w:t>
       </w:r>
       <w:r>
         <w:rPr>
           <w:lang w:val="en-IN"/>
         </w:rPr>
-        <w:t xml:space="preserve"> 1 illustrates the relationship between the three key components of DevSecOps. The development component entails code creation, system integration, and release management. On the other hand, operations involve the technical component of the system and ensure its availability, reliability, and scalability. Lastly, security encompasses scanning, identification, and controls. As illustrated by the figure </w:t>
-      </w:r>
+        <w:t xml:space="preserve">, these three components are not sequential; rather, they are concurrent. Each component influences the other two. The concept here is that if one of these three components were separated from the rest, the whole concept of </w:t>
+      </w:r>
+      <w:proofErr w:type="spellStart"/>
       <w:r>
         <w:rPr>
           <w:lang w:val="en-IN"/>
         </w:rPr>
-        <w:t>below</w:t>
-      </w:r>
+        <w:t>DevSecOps</w:t>
+      </w:r>
+      <w:proofErr w:type="spellEnd"/>
       <w:r>
         <w:rPr>
           <w:lang w:val="en-IN"/>
         </w:rPr>
-        <w:t>, these three components are not sequential; rather, they are concurrent. Each component influences the other two. The concept here is that if one of these three components were separated from the rest, the whole concept of DevSecOps will crumble</w:t>
+        <w:t xml:space="preserve"> will crumble</w:t>
       </w:r>
       <w:r>
         <w:rPr>
@@ -812,8 +961,18 @@
           <w:szCs w:val="16"/>
           <w:lang w:val="en-US"/>
         </w:rPr>
-        <w:t>Fig. 1. DevSecOps</w:t>
-      </w:r>
+        <w:t xml:space="preserve">Fig. 1. </w:t>
+      </w:r>
+      <w:proofErr w:type="spellStart"/>
+      <w:r>
+        <w:rPr>
+          <w:sz w:val="16"/>
+          <w:szCs w:val="16"/>
+          <w:lang w:val="en-US"/>
+        </w:rPr>
+        <w:t>DevSecOps</w:t>
+      </w:r>
+      <w:proofErr w:type="spellEnd"/>
     </w:p>
     <w:p>
       <w:pPr>
@@ -826,12 +985,26 @@
         <w:rPr>
           <w:lang w:val="en-US"/>
         </w:rPr>
-        <w:t xml:space="preserve">One of the main changes DevSecOps brings is automating security checks. Doing security reviews manually </w:t>
-      </w:r>
+        <w:t xml:space="preserve">One of the main changes </w:t>
+      </w:r>
+      <w:proofErr w:type="spellStart"/>
       <w:r>
         <w:rPr>
           <w:lang w:val="en-US"/>
         </w:rPr>
+        <w:t>DevSecOps</w:t>
+      </w:r>
+      <w:proofErr w:type="spellEnd"/>
+      <w:r>
+        <w:rPr>
+          <w:lang w:val="en-US"/>
+        </w:rPr>
+        <w:t xml:space="preserve"> brings is automating security checks. Doing security reviews manually </w:t>
+      </w:r>
+      <w:r>
+        <w:rPr>
+          <w:lang w:val="en-US"/>
+        </w:rPr>
         <w:t>performs poorly in situations where</w:t>
       </w:r>
       <w:r>
@@ -850,12 +1023,26 @@
         <w:rPr>
           <w:lang w:val="en-US"/>
         </w:rPr>
-        <w:t xml:space="preserve"> from one review to the next. When checks are automated and built into the pipeline they run every time a build happens. They apply the same rules every time and the results come back quickly. If something is wrong the </w:t>
-      </w:r>
+        <w:t xml:space="preserve"> from one review to the next. When checks are automated and built into the </w:t>
+      </w:r>
+      <w:proofErr w:type="gramStart"/>
       <w:r>
         <w:rPr>
           <w:lang w:val="en-US"/>
         </w:rPr>
+        <w:t>pipeline</w:t>
+      </w:r>
+      <w:proofErr w:type="gramEnd"/>
+      <w:r>
+        <w:rPr>
+          <w:lang w:val="en-US"/>
+        </w:rPr>
+        <w:t xml:space="preserve"> they run every time a build happens. They apply the same rules every time and the results come back quickly. If something is wrong the </w:t>
+      </w:r>
+      <w:r>
+        <w:rPr>
+          <w:lang w:val="en-US"/>
+        </w:rPr>
         <w:t>whoever built that particular module</w:t>
       </w:r>
       <w:r>
@@ -930,19 +1117,33 @@
         <w:rPr>
           <w:lang w:val="en-US"/>
         </w:rPr>
-        <w:t xml:space="preserve">occurs at an earlier stage of </w:t>
-      </w:r>
+        <w:t xml:space="preserve">occurs at an earlier stage </w:t>
+      </w:r>
+      <w:proofErr w:type="gramStart"/>
       <w:r>
         <w:rPr>
           <w:lang w:val="en-US"/>
         </w:rPr>
+        <w:t xml:space="preserve">of </w:t>
+      </w:r>
+      <w:r>
+        <w:rPr>
+          <w:lang w:val="en-US"/>
+        </w:rPr>
         <w:t xml:space="preserve"> </w:t>
       </w:r>
       <w:r>
         <w:rPr>
           <w:lang w:val="en-US"/>
         </w:rPr>
-        <w:t>pipeline before the application is even running anywhere.</w:t>
+        <w:t>pipeline</w:t>
+      </w:r>
+      <w:proofErr w:type="gramEnd"/>
+      <w:r>
+        <w:rPr>
+          <w:lang w:val="en-US"/>
+        </w:rPr>
+        <w:t xml:space="preserve"> before the application is even running anywhere.</w:t>
       </w:r>
     </w:p>
     <w:p>
@@ -980,12 +1181,40 @@
         <w:rPr>
           <w:lang w:val="en-US"/>
         </w:rPr>
-        <w:t>application responds suggests a vulnerability is present, OWASP ZAP picks that up. Trivy works differently — it looks at the container image and checks its components against a list of known vulnerabilities. These two tools cover different things. OWASP ZAP is focused on how the application behaves when it is running. Trivy is focused on what the container image contains. Using both means more is covered than either tool could manage on its own</w:t>
-      </w:r>
+        <w:t xml:space="preserve">application responds suggests a vulnerability is present, OWASP ZAP picks that up. </w:t>
+      </w:r>
+      <w:proofErr w:type="spellStart"/>
       <w:r>
         <w:rPr>
           <w:lang w:val="en-US"/>
         </w:rPr>
+        <w:t>Trivy</w:t>
+      </w:r>
+      <w:proofErr w:type="spellEnd"/>
+      <w:r>
+        <w:rPr>
+          <w:lang w:val="en-US"/>
+        </w:rPr>
+        <w:t xml:space="preserve"> works differently — it looks at the container image and checks its components against a list of known vulnerabilities. These two tools cover different things. OWASP ZAP is focused on how the application behaves when it is running. </w:t>
+      </w:r>
+      <w:proofErr w:type="spellStart"/>
+      <w:r>
+        <w:rPr>
+          <w:lang w:val="en-US"/>
+        </w:rPr>
+        <w:t>Trivy</w:t>
+      </w:r>
+      <w:proofErr w:type="spellEnd"/>
+      <w:r>
+        <w:rPr>
+          <w:lang w:val="en-US"/>
+        </w:rPr>
+        <w:t xml:space="preserve"> is focused on what the container image contains. Using both means more is covered than either tool could manage on its own</w:t>
+      </w:r>
+      <w:r>
+        <w:rPr>
+          <w:lang w:val="en-US"/>
+        </w:rPr>
         <w:t>.</w:t>
       </w:r>
     </w:p>
@@ -1000,7 +1229,21 @@
         <w:rPr>
           <w:lang w:val="en-US"/>
         </w:rPr>
-        <w:t>Prometheus and Grafana handle monitoring once everything is deployed. Prometheus collects data from the running system — things like how fast it is responding, how many errors are occurring, and how much of its resources it is using. Grafana takes that data and displays it in dashboards that are easy to read. If something starts going wrong the dashboards show it straight away. This matters because catching a problem early — while it is just starting — is much easier to deal with than finding out about it after it has already affected users</w:t>
+        <w:t xml:space="preserve">Prometheus and Grafana handle monitoring once everything </w:t>
+      </w:r>
+      <w:proofErr w:type="gramStart"/>
+      <w:r>
+        <w:rPr>
+          <w:lang w:val="en-US"/>
+        </w:rPr>
+        <w:t>is</w:t>
+      </w:r>
+      <w:proofErr w:type="gramEnd"/>
+      <w:r>
+        <w:rPr>
+          <w:lang w:val="en-US"/>
+        </w:rPr>
+        <w:t xml:space="preserve"> deployed. Prometheus collects data from the running system — things like how fast it is responding, how many errors are occurring, and how much of its resources it is using. Grafana takes that data and displays it in dashboards that are easy to read. If something starts going wrong the dashboards show it straight away. This matters because catching a problem early — while it is just starting — is much easier to deal with than finding out about it after it has already affected users</w:t>
       </w:r>
       <w:r>
         <w:rPr>
@@ -1057,7 +1300,35 @@
         <w:rPr>
           <w:rFonts w:eastAsia="Times New Roman"/>
         </w:rPr>
-        <w:t>One thing early DevSecOps research kept bringing up was that security was getting pushed to the side inside DevOps pipelines. It was not being ignored completely, but it was clearly not being treated as a priority either. Nikolov and Aleksieva-Petrova (2023) wanted to look at this more closely and chose Jenkins as their environment. They put Snyk and OWASP ZAP into the pipeline at various points. The idea was to check which stages were actually picking up security issues and which ones were missing them. Finding vulnerabilities before deployment was shown to be possible, which was a useful outcome. That said, container security was not part of what they looked at, and nothing was set up to monitor the system after it went live</w:t>
+        <w:t xml:space="preserve">One thing early </w:t>
+      </w:r>
+      <w:proofErr w:type="spellStart"/>
+      <w:r>
+        <w:rPr>
+          <w:rFonts w:eastAsia="Times New Roman"/>
+        </w:rPr>
+        <w:t>DevSecOps</w:t>
+      </w:r>
+      <w:proofErr w:type="spellEnd"/>
+      <w:r>
+        <w:rPr>
+          <w:rFonts w:eastAsia="Times New Roman"/>
+        </w:rPr>
+        <w:t xml:space="preserve"> research kept bringing up was that security was getting pushed to the side inside DevOps pipelines. It was not being ignored completely, but it was clearly not being treated as a priority either. Nikolov and Aleksieva-Petrova (2023) wanted to look at this more closely and chose Jenkins as their environment. They put </w:t>
+      </w:r>
+      <w:proofErr w:type="spellStart"/>
+      <w:r>
+        <w:rPr>
+          <w:rFonts w:eastAsia="Times New Roman"/>
+        </w:rPr>
+        <w:t>Snyk</w:t>
+      </w:r>
+      <w:proofErr w:type="spellEnd"/>
+      <w:r>
+        <w:rPr>
+          <w:rFonts w:eastAsia="Times New Roman"/>
+        </w:rPr>
+        <w:t xml:space="preserve"> and OWASP ZAP into the pipeline at various points. The idea was to check which stages were actually picking up security issues and which ones were missing them. Finding vulnerabilities before deployment was shown to be possible, which was a useful outcome. That said, container security was not part of what they looked at, and nothing was set up to monitor the system after it went live</w:t>
       </w:r>
       <w:r>
         <w:rPr>
@@ -1090,7 +1361,35 @@
         <w:rPr>
           <w:rFonts w:eastAsia="Times New Roman"/>
         </w:rPr>
-        <w:t>Marandi et al. (2023) took a different approach entirely. Rather than Jenkins they used GitHub Actions as the base for their pipeline. Snyk and StackHawk were the tools they worked with, and Docker was running alongside everything. They did not stop at just scanning either — dashboards were added and parts of the remediation process were automated, so when issues came up the team had less manual work to get through. Even with those additions though, scanning container images and watching the runtime environment were still not covered.</w:t>
+        <w:t xml:space="preserve">Marandi et al. (2023) took a different approach entirely. Rather than Jenkins they used GitHub Actions as the base for their pipeline. </w:t>
+      </w:r>
+      <w:proofErr w:type="spellStart"/>
+      <w:r>
+        <w:rPr>
+          <w:rFonts w:eastAsia="Times New Roman"/>
+        </w:rPr>
+        <w:t>Snyk</w:t>
+      </w:r>
+      <w:proofErr w:type="spellEnd"/>
+      <w:r>
+        <w:rPr>
+          <w:rFonts w:eastAsia="Times New Roman"/>
+        </w:rPr>
+        <w:t xml:space="preserve"> and </w:t>
+      </w:r>
+      <w:proofErr w:type="spellStart"/>
+      <w:r>
+        <w:rPr>
+          <w:rFonts w:eastAsia="Times New Roman"/>
+        </w:rPr>
+        <w:t>StackHawk</w:t>
+      </w:r>
+      <w:proofErr w:type="spellEnd"/>
+      <w:r>
+        <w:rPr>
+          <w:rFonts w:eastAsia="Times New Roman"/>
+        </w:rPr>
+        <w:t xml:space="preserve"> were the tools they worked with, and Docker was running alongside everything. They did not stop at just scanning either — dashboards were added and parts of the remediation process were automated, so when issues came up the team had less manual work to get through. Even with those additions though, scanning container images and watching the runtime environment were still not covered.</w:t>
       </w:r>
     </w:p>
     <w:p>
@@ -1111,7 +1410,35 @@
         <w:rPr>
           <w:rFonts w:eastAsia="Times New Roman"/>
         </w:rPr>
-        <w:t xml:space="preserve">Around this same period some researchers started looking beyond the technical side of things. Nayanajith and Wickramarachchi (2024) found that the biggest obstacles teams were hitting during DevSecOps adoption were not really about which tools to pick or how to configure them. Skill gaps were a common issue, and so was </w:t>
+        <w:t xml:space="preserve">Around this same period some researchers started looking beyond the technical side of things. </w:t>
+      </w:r>
+      <w:proofErr w:type="spellStart"/>
+      <w:r>
+        <w:rPr>
+          <w:rFonts w:eastAsia="Times New Roman"/>
+        </w:rPr>
+        <w:t>Nayanajith</w:t>
+      </w:r>
+      <w:proofErr w:type="spellEnd"/>
+      <w:r>
+        <w:rPr>
+          <w:rFonts w:eastAsia="Times New Roman"/>
+        </w:rPr>
+        <w:t xml:space="preserve"> and Wickramarachchi (2024) found that the biggest obstacles teams were hitting during </w:t>
+      </w:r>
+      <w:proofErr w:type="spellStart"/>
+      <w:r>
+        <w:rPr>
+          <w:rFonts w:eastAsia="Times New Roman"/>
+        </w:rPr>
+        <w:t>DevSecOps</w:t>
+      </w:r>
+      <w:proofErr w:type="spellEnd"/>
+      <w:r>
+        <w:rPr>
+          <w:rFonts w:eastAsia="Times New Roman"/>
+        </w:rPr>
+        <w:t xml:space="preserve"> adoption were not really about which tools to pick or how to configure them. Skill gaps were a common issue, and so was </w:t>
       </w:r>
       <w:r>
         <w:rPr>
@@ -1141,7 +1468,21 @@
         <w:rPr>
           <w:rFonts w:eastAsia="Times New Roman"/>
         </w:rPr>
-        <w:t>. On top of that, different groups within the same organisation were often not communicating well with each other. Fixing the technical setup was the easier part of the problem — shifting how people actually worked and collaborated on a daily basis was where things got genuinely difficult</w:t>
+        <w:t xml:space="preserve">. On top of that, different groups within the same </w:t>
+      </w:r>
+      <w:proofErr w:type="spellStart"/>
+      <w:r>
+        <w:rPr>
+          <w:rFonts w:eastAsia="Times New Roman"/>
+        </w:rPr>
+        <w:t>organisation</w:t>
+      </w:r>
+      <w:proofErr w:type="spellEnd"/>
+      <w:r>
+        <w:rPr>
+          <w:rFonts w:eastAsia="Times New Roman"/>
+        </w:rPr>
+        <w:t xml:space="preserve"> were often not communicating well with each other. Fixing the technical setup was the easier part of the problem — shifting how people actually worked and collaborated on a daily basis was where things got genuinely difficult</w:t>
       </w:r>
       <w:r>
         <w:rPr>
@@ -1327,7 +1668,21 @@
         <w:rPr>
           <w:rFonts w:eastAsia="Times New Roman"/>
         </w:rPr>
-        <w:t xml:space="preserve">noted that Trivy </w:t>
+        <w:t xml:space="preserve">noted that </w:t>
+      </w:r>
+      <w:proofErr w:type="spellStart"/>
+      <w:r>
+        <w:rPr>
+          <w:rFonts w:eastAsia="Times New Roman"/>
+        </w:rPr>
+        <w:t>Trivy</w:t>
+      </w:r>
+      <w:proofErr w:type="spellEnd"/>
+      <w:r>
+        <w:rPr>
+          <w:rFonts w:eastAsia="Times New Roman"/>
+        </w:rPr>
+        <w:t xml:space="preserve"> </w:t>
       </w:r>
       <w:r>
         <w:rPr>
@@ -1360,13 +1715,34 @@
         <w:rPr>
           <w:rFonts w:eastAsia="Times New Roman"/>
         </w:rPr>
-        <w:t xml:space="preserve">In DevSecOps, some studies follow the CAMS model. </w:t>
-      </w:r>
-      <w:r>
-        <w:rPr>
-          <w:rFonts w:eastAsia="Times New Roman"/>
-        </w:rPr>
-        <w:t>This mainly includes culture, automation, measurement and sharing.</w:t>
+        <w:t xml:space="preserve">In </w:t>
+      </w:r>
+      <w:proofErr w:type="spellStart"/>
+      <w:r>
+        <w:rPr>
+          <w:rFonts w:eastAsia="Times New Roman"/>
+        </w:rPr>
+        <w:t>DevSecOps</w:t>
+      </w:r>
+      <w:proofErr w:type="spellEnd"/>
+      <w:r>
+        <w:rPr>
+          <w:rFonts w:eastAsia="Times New Roman"/>
+        </w:rPr>
+        <w:t xml:space="preserve">, some studies follow the CAMS model. </w:t>
+      </w:r>
+      <w:r>
+        <w:rPr>
+          <w:rFonts w:eastAsia="Times New Roman"/>
+        </w:rPr>
+        <w:t xml:space="preserve">This mainly includes culture, automation, measurement and </w:t>
+      </w:r>
+      <w:proofErr w:type="gramStart"/>
+      <w:r>
+        <w:rPr>
+          <w:rFonts w:eastAsia="Times New Roman"/>
+        </w:rPr>
+        <w:t>sharing.</w:t>
       </w:r>
       <w:r>
         <w:rPr>
@@ -1374,6 +1750,7 @@
         </w:rPr>
         <w:t>.</w:t>
       </w:r>
+      <w:proofErr w:type="gramEnd"/>
       <w:r>
         <w:rPr>
           <w:rFonts w:eastAsia="Times New Roman"/>
@@ -1390,7 +1767,21 @@
         <w:rPr>
           <w:rFonts w:eastAsia="Times New Roman"/>
         </w:rPr>
-        <w:t xml:space="preserve"> when applying DevSecOps in real situations </w:t>
+        <w:t xml:space="preserve"> when applying </w:t>
+      </w:r>
+      <w:proofErr w:type="spellStart"/>
+      <w:r>
+        <w:rPr>
+          <w:rFonts w:eastAsia="Times New Roman"/>
+        </w:rPr>
+        <w:t>DevSecOps</w:t>
+      </w:r>
+      <w:proofErr w:type="spellEnd"/>
+      <w:r>
+        <w:rPr>
+          <w:rFonts w:eastAsia="Times New Roman"/>
+        </w:rPr>
+        <w:t xml:space="preserve"> in real situations </w:t>
       </w:r>
       <w:r>
         <w:rPr>
@@ -1408,7 +1799,21 @@
         <w:rPr>
           <w:rFonts w:eastAsia="Times New Roman"/>
         </w:rPr>
-        <w:t>use DevSecOps in</w:t>
+        <w:t xml:space="preserve">use </w:t>
+      </w:r>
+      <w:proofErr w:type="spellStart"/>
+      <w:r>
+        <w:rPr>
+          <w:rFonts w:eastAsia="Times New Roman"/>
+        </w:rPr>
+        <w:t>DevSecOps</w:t>
+      </w:r>
+      <w:proofErr w:type="spellEnd"/>
+      <w:r>
+        <w:rPr>
+          <w:rFonts w:eastAsia="Times New Roman"/>
+        </w:rPr>
+        <w:t xml:space="preserve"> in</w:t>
       </w:r>
       <w:r>
         <w:rPr>
@@ -1432,7 +1837,21 @@
         <w:rPr>
           <w:rFonts w:eastAsia="Times New Roman"/>
         </w:rPr>
-        <w:t xml:space="preserve">applying DevSecOps in real environments. It </w:t>
+        <w:t xml:space="preserve">applying </w:t>
+      </w:r>
+      <w:proofErr w:type="spellStart"/>
+      <w:r>
+        <w:rPr>
+          <w:rFonts w:eastAsia="Times New Roman"/>
+        </w:rPr>
+        <w:t>DevSecOps</w:t>
+      </w:r>
+      <w:proofErr w:type="spellEnd"/>
+      <w:r>
+        <w:rPr>
+          <w:rFonts w:eastAsia="Times New Roman"/>
+        </w:rPr>
+        <w:t xml:space="preserve"> in real environments. It </w:t>
       </w:r>
       <w:r>
         <w:rPr>
@@ -1444,7 +1863,14 @@
         <w:rPr>
           <w:rFonts w:eastAsia="Times New Roman"/>
         </w:rPr>
-        <w:t>an effect on</w:t>
+        <w:t xml:space="preserve">an effect </w:t>
+      </w:r>
+      <w:proofErr w:type="gramStart"/>
+      <w:r>
+        <w:rPr>
+          <w:rFonts w:eastAsia="Times New Roman"/>
+        </w:rPr>
+        <w:t>on</w:t>
       </w:r>
       <w:r>
         <w:rPr>
@@ -1456,13 +1882,34 @@
         <w:rPr>
           <w:rFonts w:eastAsia="Times New Roman"/>
         </w:rPr>
-        <w:t xml:space="preserve"> a strong effect on</w:t>
-      </w:r>
-      <w:r>
-        <w:rPr>
-          <w:rFonts w:eastAsia="Times New Roman"/>
-        </w:rPr>
-        <w:t xml:space="preserve"> successfully applying DevSecOps in real environments.</w:t>
+        <w:t xml:space="preserve"> a</w:t>
+      </w:r>
+      <w:proofErr w:type="gramEnd"/>
+      <w:r>
+        <w:rPr>
+          <w:rFonts w:eastAsia="Times New Roman"/>
+        </w:rPr>
+        <w:t xml:space="preserve"> strong effect on</w:t>
+      </w:r>
+      <w:r>
+        <w:rPr>
+          <w:rFonts w:eastAsia="Times New Roman"/>
+        </w:rPr>
+        <w:t xml:space="preserve"> successfully applying </w:t>
+      </w:r>
+      <w:proofErr w:type="spellStart"/>
+      <w:r>
+        <w:rPr>
+          <w:rFonts w:eastAsia="Times New Roman"/>
+        </w:rPr>
+        <w:t>DevSecOps</w:t>
+      </w:r>
+      <w:proofErr w:type="spellEnd"/>
+      <w:r>
+        <w:rPr>
+          <w:rFonts w:eastAsia="Times New Roman"/>
+        </w:rPr>
+        <w:t xml:space="preserve"> in real environments.</w:t>
       </w:r>
     </w:p>
     <w:p>
@@ -1540,7 +1987,21 @@
         <w:rPr>
           <w:rFonts w:eastAsia="Times New Roman"/>
         </w:rPr>
-        <w:t>From these studies, it is observed that DevSecOps is improving, but some gaps still remain. From these studies, it appears that many works focus only on specific parts such as scanning or monitoring, but do not cover the complete pipeline.</w:t>
+        <w:t xml:space="preserve">From these studies, it is observed that </w:t>
+      </w:r>
+      <w:proofErr w:type="spellStart"/>
+      <w:r>
+        <w:rPr>
+          <w:rFonts w:eastAsia="Times New Roman"/>
+        </w:rPr>
+        <w:t>DevSecOps</w:t>
+      </w:r>
+      <w:proofErr w:type="spellEnd"/>
+      <w:r>
+        <w:rPr>
+          <w:rFonts w:eastAsia="Times New Roman"/>
+        </w:rPr>
+        <w:t xml:space="preserve"> is improving, but some gaps still remain. From these studies, it appears that many works focus only on specific parts such as scanning or monitoring, but do not cover the complete pipeline.</w:t>
       </w:r>
     </w:p>
     <w:p>
@@ -1562,7 +2023,21 @@
         <w:rPr>
           <w:rFonts w:eastAsia="Times New Roman"/>
         </w:rPr>
-        <w:t>Looking across these studies, a pattern becomes clear — most of them tackle one or two pieces of the pipeline rather than treating it as a whole. This work takes a different angle by connecting those pieces into something more complete. Static testing, dynamic testing, container scanning through Trivy, and continuous monitoring via Prometheus and Grafana are all brought into a single pipeline rather than handled separately</w:t>
+        <w:t xml:space="preserve">Looking across these studies, a pattern becomes clear — most of them tackle one or two pieces of the pipeline rather than treating it as a whole. This work takes a different angle by connecting those pieces into something more complete. Static testing, dynamic testing, container scanning through </w:t>
+      </w:r>
+      <w:proofErr w:type="spellStart"/>
+      <w:r>
+        <w:rPr>
+          <w:rFonts w:eastAsia="Times New Roman"/>
+        </w:rPr>
+        <w:t>Trivy</w:t>
+      </w:r>
+      <w:proofErr w:type="spellEnd"/>
+      <w:r>
+        <w:rPr>
+          <w:rFonts w:eastAsia="Times New Roman"/>
+        </w:rPr>
+        <w:t>, and continuous monitoring via Prometheus and Grafana are all brought into a single pipeline rather than handled separately</w:t>
       </w:r>
       <w:r>
         <w:rPr>
@@ -1658,7 +2133,21 @@
         <w:rPr>
           <w:rFonts w:eastAsia="Times New Roman"/>
         </w:rPr>
-        <w:t>, organizations face problems when trying to use DevSecOps in actual projects.</w:t>
+        <w:t xml:space="preserve">, organizations face problems when trying to use </w:t>
+      </w:r>
+      <w:proofErr w:type="spellStart"/>
+      <w:r>
+        <w:rPr>
+          <w:rFonts w:eastAsia="Times New Roman"/>
+        </w:rPr>
+        <w:t>DevSecOps</w:t>
+      </w:r>
+      <w:proofErr w:type="spellEnd"/>
+      <w:r>
+        <w:rPr>
+          <w:rFonts w:eastAsia="Times New Roman"/>
+        </w:rPr>
+        <w:t xml:space="preserve"> in actual projects.</w:t>
       </w:r>
       <w:r>
         <w:rPr>
@@ -1744,13 +2233,27 @@
         <w:rPr>
           <w:rFonts w:eastAsia="Times New Roman"/>
         </w:rPr>
-        <w:t xml:space="preserve">In our work, we tried to avoid these problems by adding security checks directly into the pipeline so </w:t>
-      </w:r>
-      <w:r>
-        <w:rPr>
-          <w:rFonts w:eastAsia="Times New Roman"/>
-        </w:rPr>
-        <w:t xml:space="preserve"> they run together with</w:t>
+        <w:t xml:space="preserve">In our work, we tried to avoid these problems by adding security checks directly into the pipeline </w:t>
+      </w:r>
+      <w:proofErr w:type="gramStart"/>
+      <w:r>
+        <w:rPr>
+          <w:rFonts w:eastAsia="Times New Roman"/>
+        </w:rPr>
+        <w:t xml:space="preserve">so </w:t>
+      </w:r>
+      <w:r>
+        <w:rPr>
+          <w:rFonts w:eastAsia="Times New Roman"/>
+        </w:rPr>
+        <w:t xml:space="preserve"> they</w:t>
+      </w:r>
+      <w:proofErr w:type="gramEnd"/>
+      <w:r>
+        <w:rPr>
+          <w:rFonts w:eastAsia="Times New Roman"/>
+        </w:rPr>
+        <w:t xml:space="preserve"> run together with</w:t>
       </w:r>
       <w:r>
         <w:rPr>
@@ -1806,7 +2309,14 @@
         <w:rPr>
           <w:rFonts w:eastAsia="Times New Roman"/>
         </w:rPr>
-        <w:t xml:space="preserve">is observable in </w:t>
+        <w:t xml:space="preserve">is observable </w:t>
+      </w:r>
+      <w:proofErr w:type="gramStart"/>
+      <w:r>
+        <w:rPr>
+          <w:rFonts w:eastAsia="Times New Roman"/>
+        </w:rPr>
+        <w:t xml:space="preserve">in </w:t>
       </w:r>
       <w:r>
         <w:rPr>
@@ -1818,7 +2328,14 @@
         <w:rPr>
           <w:rFonts w:eastAsia="Times New Roman"/>
         </w:rPr>
-        <w:t>early.</w:t>
+        <w:t>early</w:t>
+      </w:r>
+      <w:proofErr w:type="gramEnd"/>
+      <w:r>
+        <w:rPr>
+          <w:rFonts w:eastAsia="Times New Roman"/>
+        </w:rPr>
+        <w:t>.</w:t>
       </w:r>
     </w:p>
     <w:p>
@@ -2187,7 +2704,21 @@
         <w:rPr>
           <w:rFonts w:eastAsia="Times New Roman"/>
         </w:rPr>
-        <w:t>Using this approach, the system becomes more secure and simpler to manage. Issues can be noticed earlier, and overall the process becomes easier to deal with.</w:t>
+        <w:t xml:space="preserve">Using this approach, the system becomes more secure and simpler to manage. Issues can be noticed earlier, and </w:t>
+      </w:r>
+      <w:proofErr w:type="gramStart"/>
+      <w:r>
+        <w:rPr>
+          <w:rFonts w:eastAsia="Times New Roman"/>
+        </w:rPr>
+        <w:t>overall</w:t>
+      </w:r>
+      <w:proofErr w:type="gramEnd"/>
+      <w:r>
+        <w:rPr>
+          <w:rFonts w:eastAsia="Times New Roman"/>
+        </w:rPr>
+        <w:t xml:space="preserve"> the process becomes easier to deal with.</w:t>
       </w:r>
     </w:p>
     <w:p>
@@ -4088,8 +4619,13 @@
       <w:r>
         <w:t xml:space="preserve">portion of the broader </w:t>
       </w:r>
-      <w:r>
-        <w:t>DevSecOps pipeline individually, starting from the point where code first enters the system and following it all the way into production. The pipeline ran without interruption across all these stages, which itself confirmed that the integration held together under real conditions</w:t>
+      <w:proofErr w:type="spellStart"/>
+      <w:r>
+        <w:t>DevSecOps</w:t>
+      </w:r>
+      <w:proofErr w:type="spellEnd"/>
+      <w:r>
+        <w:t xml:space="preserve"> pipeline individually, starting from the point where code first enters the system and following it all the way into production. The pipeline ran without interruption across all these stages, which itself confirmed that the integration held together under real conditions</w:t>
       </w:r>
       <w:r>
         <w:rPr>
@@ -4118,7 +4654,17 @@
         <w:t xml:space="preserve"> </w:t>
       </w:r>
       <w:r>
-        <w:t>traveled further down the line got caught early, leaving fewer things to deal with in later stages.Container images got scanned before anything was allowed to proceed, so whatever reached the deployment stage had already been checked and cleared — reducing the chances of something problematic slipping through that layer</w:t>
+        <w:t xml:space="preserve">traveled further down the line got caught early, leaving fewer things to deal with in later </w:t>
+      </w:r>
+      <w:proofErr w:type="spellStart"/>
+      <w:proofErr w:type="gramStart"/>
+      <w:r>
+        <w:t>stages.Container</w:t>
+      </w:r>
+      <w:proofErr w:type="spellEnd"/>
+      <w:proofErr w:type="gramEnd"/>
+      <w:r>
+        <w:t xml:space="preserve"> images got scanned before anything was allowed to proceed, so whatever reached the deployment stage had already been checked and cleared — reducing the chances of something problematic slipping through that layer</w:t>
       </w:r>
       <w:r>
         <w:t>.</w:t>
@@ -7106,7 +7652,6 @@
   <w:style w:type="character" w:default="1" w:styleId="DefaultParagraphFont">
     <w:name w:val="Default Paragraph Font"/>
     <w:uiPriority w:val="1"/>
-    <w:semiHidden/>
     <w:unhideWhenUsed/>
   </w:style>
   <w:style w:type="table" w:default="1" w:styleId="TableNormal">

</xml_diff>